<commit_message>
feat: complete white-labeled SaaS structure with structural NLP randomization
</commit_message>
<xml_diff>
--- a/Word Document/Auto Place Review over GMB profile.docx
+++ b/Word Document/Auto Place Review over GMB profile.docx
@@ -5,6 +5,7 @@
     <w:p>
       <w:pPr>
         <w:spacing w:before="100" w:beforeAutospacing="1" w:after="100" w:afterAutospacing="1" w:line="240" w:lineRule="auto"/>
+        <w:jc w:val="center"/>
         <w:outlineLvl w:val="1"/>
         <w:rPr>
           <w:rFonts w:ascii="Times New Roman" w:eastAsia="Times New Roman" w:hAnsi="Times New Roman" w:cs="Times New Roman"/>
@@ -12,20 +13,46 @@
           <w:bCs/>
           <w:sz w:val="36"/>
           <w:szCs w:val="36"/>
+          <w:u w:val="single"/>
         </w:rPr>
       </w:pPr>
       <w:r>
+        <w:rPr>
+          <w:b/>
+          <w:bCs/>
+          <w:u w:val="single"/>
+        </w:rPr>
+        <w:t>Senior AI Solutions Architect</w:t>
+      </w:r>
+      <w:r>
+        <w:rPr>
+          <w:b/>
+          <w:bCs/>
+          <w:u w:val="single"/>
+        </w:rPr>
+        <w:t>ure</w:t>
+      </w:r>
+    </w:p>
+    <w:p>
+      <w:pPr>
+        <w:spacing w:before="100" w:beforeAutospacing="1" w:after="100" w:afterAutospacing="1" w:line="240" w:lineRule="auto"/>
+        <w:outlineLvl w:val="1"/>
         <w:rPr>
           <w:rFonts w:ascii="Times New Roman" w:eastAsia="Times New Roman" w:hAnsi="Times New Roman" w:cs="Times New Roman"/>
           <w:b/>
           <w:bCs/>
           <w:sz w:val="36"/>
           <w:szCs w:val="36"/>
-        </w:rPr>
-        <w:t xml:space="preserve">Google </w:t>
-      </w:r>
-      <w:proofErr w:type="spellStart"/>
-      <w:r>
+          <w:u w:val="single"/>
+        </w:rPr>
+      </w:pPr>
+      <w:bookmarkStart w:id="0" w:name="_GoBack"/>
+      <w:bookmarkEnd w:id="0"/>
+    </w:p>
+    <w:p>
+      <w:pPr>
+        <w:spacing w:before="100" w:beforeAutospacing="1" w:after="100" w:afterAutospacing="1" w:line="240" w:lineRule="auto"/>
+        <w:outlineLvl w:val="1"/>
         <w:rPr>
           <w:rFonts w:ascii="Times New Roman" w:eastAsia="Times New Roman" w:hAnsi="Times New Roman" w:cs="Times New Roman"/>
           <w:b/>
@@ -33,10 +60,12 @@
           <w:sz w:val="36"/>
           <w:szCs w:val="36"/>
         </w:rPr>
-        <w:t>Ka</w:t>
-      </w:r>
-      <w:proofErr w:type="spellEnd"/>
-      <w:r>
+      </w:pPr>
+    </w:p>
+    <w:p>
+      <w:pPr>
+        <w:spacing w:before="100" w:beforeAutospacing="1" w:after="100" w:afterAutospacing="1" w:line="240" w:lineRule="auto"/>
+        <w:outlineLvl w:val="1"/>
         <w:rPr>
           <w:rFonts w:ascii="Times New Roman" w:eastAsia="Times New Roman" w:hAnsi="Times New Roman" w:cs="Times New Roman"/>
           <w:b/>
@@ -44,9 +73,7 @@
           <w:sz w:val="36"/>
           <w:szCs w:val="36"/>
         </w:rPr>
-        <w:t xml:space="preserve"> Security Wall </w:t>
-      </w:r>
-      <w:proofErr w:type="spellStart"/>
+      </w:pPr>
       <w:r>
         <w:rPr>
           <w:rFonts w:ascii="Times New Roman" w:eastAsia="Times New Roman" w:hAnsi="Times New Roman" w:cs="Times New Roman"/>
@@ -55,9 +82,9 @@
           <w:sz w:val="36"/>
           <w:szCs w:val="36"/>
         </w:rPr>
-        <w:t>Aur</w:t>
-      </w:r>
-      <w:proofErr w:type="spellEnd"/>
+        <w:t xml:space="preserve">Google </w:t>
+      </w:r>
+      <w:proofErr w:type="spellStart"/>
       <w:r>
         <w:rPr>
           <w:rFonts w:ascii="Times New Roman" w:eastAsia="Times New Roman" w:hAnsi="Times New Roman" w:cs="Times New Roman"/>
@@ -66,9 +93,9 @@
           <w:sz w:val="36"/>
           <w:szCs w:val="36"/>
         </w:rPr>
-        <w:t xml:space="preserve"> </w:t>
-      </w:r>
-      <w:proofErr w:type="spellStart"/>
+        <w:t>Ka</w:t>
+      </w:r>
+      <w:proofErr w:type="spellEnd"/>
       <w:r>
         <w:rPr>
           <w:rFonts w:ascii="Times New Roman" w:eastAsia="Times New Roman" w:hAnsi="Times New Roman" w:cs="Times New Roman"/>
@@ -77,9 +104,9 @@
           <w:sz w:val="36"/>
           <w:szCs w:val="36"/>
         </w:rPr>
-        <w:t>Asli</w:t>
-      </w:r>
-      <w:proofErr w:type="spellEnd"/>
+        <w:t xml:space="preserve"> Security Wall </w:t>
+      </w:r>
+      <w:proofErr w:type="spellStart"/>
       <w:r>
         <w:rPr>
           <w:rFonts w:ascii="Times New Roman" w:eastAsia="Times New Roman" w:hAnsi="Times New Roman" w:cs="Times New Roman"/>
@@ -88,6 +115,39 @@
           <w:sz w:val="36"/>
           <w:szCs w:val="36"/>
         </w:rPr>
+        <w:t>Aur</w:t>
+      </w:r>
+      <w:proofErr w:type="spellEnd"/>
+      <w:r>
+        <w:rPr>
+          <w:rFonts w:ascii="Times New Roman" w:eastAsia="Times New Roman" w:hAnsi="Times New Roman" w:cs="Times New Roman"/>
+          <w:b/>
+          <w:bCs/>
+          <w:sz w:val="36"/>
+          <w:szCs w:val="36"/>
+        </w:rPr>
+        <w:t xml:space="preserve"> </w:t>
+      </w:r>
+      <w:proofErr w:type="spellStart"/>
+      <w:r>
+        <w:rPr>
+          <w:rFonts w:ascii="Times New Roman" w:eastAsia="Times New Roman" w:hAnsi="Times New Roman" w:cs="Times New Roman"/>
+          <w:b/>
+          <w:bCs/>
+          <w:sz w:val="36"/>
+          <w:szCs w:val="36"/>
+        </w:rPr>
+        <w:t>Asli</w:t>
+      </w:r>
+      <w:proofErr w:type="spellEnd"/>
+      <w:r>
+        <w:rPr>
+          <w:rFonts w:ascii="Times New Roman" w:eastAsia="Times New Roman" w:hAnsi="Times New Roman" w:cs="Times New Roman"/>
+          <w:b/>
+          <w:bCs/>
+          <w:sz w:val="36"/>
+          <w:szCs w:val="36"/>
+        </w:rPr>
         <w:t xml:space="preserve"> Mechanism</w:t>
       </w:r>
     </w:p>
@@ -970,29 +1030,7 @@
           <w:sz w:val="24"/>
           <w:szCs w:val="24"/>
         </w:rPr>
-        <w:t>"1-</w:t>
-      </w:r>
-      <w:bookmarkStart w:id="0" w:name="_GoBack"/>
-      <w:r>
-        <w:rPr>
-          <w:rFonts w:ascii="Times New Roman" w:eastAsia="Times New Roman" w:hAnsi="Times New Roman" w:cs="Times New Roman"/>
-          <w:b/>
-          <w:bCs/>
-          <w:sz w:val="24"/>
-          <w:szCs w:val="24"/>
-        </w:rPr>
-        <w:t>Click GMB Deep Linking &amp; Clipboard Sync Mechanism</w:t>
-      </w:r>
-      <w:bookmarkEnd w:id="0"/>
-      <w:r>
-        <w:rPr>
-          <w:rFonts w:ascii="Times New Roman" w:eastAsia="Times New Roman" w:hAnsi="Times New Roman" w:cs="Times New Roman"/>
-          <w:b/>
-          <w:bCs/>
-          <w:sz w:val="24"/>
-          <w:szCs w:val="24"/>
-        </w:rPr>
-        <w:t>"</w:t>
+        <w:t>"1-Click GMB Deep Linking &amp; Clipboard Sync Mechanism"</w:t>
       </w:r>
       <w:r>
         <w:rPr>

</xml_diff>